<commit_message>
[EMRToolkit] HisTestIndex: bo sung ma dung chung va ma HL7 cho chi so xet nghiem
- Them 2 o nhap "Ma dung chung" (COMMON_CODE) va "Ma HL7" (HL7_CODE), MaxLength 50,
  dat o cuoi nhom thong tin chi so; them 2 cot tuong ung tren luoi danh muc
- Nap va luu 2 truong trong UpdateDTOFromDataForm; caption khai o Lang.vi/en.resx
- COMMON_CODE la ma gui len cong EMRToolkit o truong MaDungChung; chua khai thi tien
  trinh trong MOS tu dung TEST_INDEX_CODE (fallback, co log Warn)
- HL7_CODE phuc vu trao doi ban tin HL7 voi may xet nghiem va he thong ngoai

Can chay kem: DDL trong docs/SQL_EmrToolkit_LabResult.sql (phan 2B) va cap nhat
MOS.EFMODEL (EDMX + entity HIS_TEST_INDEX, V_HIS_TEST_INDEX) phia backend.

Co-Authored-By: Claude Opus 5 (1M context) <noreply@anthropic.com>
</commit_message>
<xml_diff>
--- a/docs/B_KyThuat_LienThongKQCanLamSang_EMRToolkit.docx
+++ b/docs/B_KyThuat_LienThongKQCanLamSang_EMRToolkit.docx
@@ -6339,6 +6339,111 @@
           </w:p>
         </w:tc>
       </w:tr>
+      <w:tr>
+        <w:trPr>
+          <w:tblHeader w:val="false"/>
+        </w:trPr>
+        <w:tc>
+          <w:tcPr>
+            <w:tcW w:type="dxa" w:w="2059"/>
+            <w:tcMar>
+              <w:top w:type="dxa" w:w="60"/>
+              <w:left w:type="dxa" w:w="90"/>
+              <w:bottom w:type="dxa" w:w="60"/>
+              <w:right w:type="dxa" w:w="90"/>
+            </w:tcMar>
+          </w:tcPr>
+          <w:p>
+            <w:pPr>
+              <w:spacing w:after="0"/>
+            </w:pPr>
+            <w:r>
+              <w:rPr>
+                <w:b w:val="false"/>
+                <w:bCs w:val="false"/>
+                <w:sz w:val="20"/>
+                <w:szCs w:val="20"/>
+              </w:rPr>
+              <w:t xml:space="preserve">— (chưa gửi cổng)</w:t>
+            </w:r>
+          </w:p>
+        </w:tc>
+        <w:tc>
+          <w:tcPr>
+            <w:tcW w:type="dxa" w:w="3182"/>
+            <w:tcMar>
+              <w:top w:type="dxa" w:w="60"/>
+              <w:left w:type="dxa" w:w="90"/>
+              <w:bottom w:type="dxa" w:w="60"/>
+              <w:right w:type="dxa" w:w="90"/>
+            </w:tcMar>
+          </w:tcPr>
+          <w:p>
+            <w:pPr>
+              <w:spacing w:after="0"/>
+            </w:pPr>
+            <w:r>
+              <w:rPr>
+                <w:b w:val="false"/>
+                <w:bCs w:val="false"/>
+                <w:sz w:val="20"/>
+                <w:szCs w:val="20"/>
+              </w:rPr>
+              <w:t xml:space="preserve">HIS_TEST_INDEX.HL7_CODE</w:t>
+            </w:r>
+          </w:p>
+        </w:tc>
+        <w:tc>
+          <w:tcPr>
+            <w:tcW w:type="dxa" w:w="1872"/>
+            <w:tcMar>
+              <w:top w:type="dxa" w:w="60"/>
+              <w:left w:type="dxa" w:w="90"/>
+              <w:bottom w:type="dxa" w:w="60"/>
+              <w:right w:type="dxa" w:w="90"/>
+            </w:tcMar>
+          </w:tcPr>
+          <w:p>
+            <w:pPr>
+              <w:spacing w:after="0"/>
+            </w:pPr>
+            <w:r>
+              <w:rPr>
+                <w:b w:val="false"/>
+                <w:bCs w:val="false"/>
+                <w:sz w:val="20"/>
+                <w:szCs w:val="20"/>
+              </w:rPr>
+              <w:t xml:space="preserve">Cột mới — mã chỉ số theo chuẩn HL7, phục vụ trao đổi bản tin với máy xét nghiệm</w:t>
+            </w:r>
+          </w:p>
+        </w:tc>
+        <w:tc>
+          <w:tcPr>
+            <w:tcW w:type="dxa" w:w="2246"/>
+            <w:tcMar>
+              <w:top w:type="dxa" w:w="60"/>
+              <w:left w:type="dxa" w:w="90"/>
+              <w:bottom w:type="dxa" w:w="60"/>
+              <w:right w:type="dxa" w:w="90"/>
+            </w:tcMar>
+          </w:tcPr>
+          <w:p>
+            <w:pPr>
+              <w:spacing w:after="0"/>
+            </w:pPr>
+            <w:r>
+              <w:rPr>
+                <w:b w:val="false"/>
+                <w:bCs w:val="false"/>
+                <w:sz w:val="20"/>
+                <w:szCs w:val="20"/>
+              </w:rPr>
+              <w:t xml:space="preserve">Plugin HisTestIndex, ô nhập mới</w:t>
+            </w:r>
+          </w:p>
+        </w:tc>
+      </w:tr>
     </w:tbl>
     <w:p>
       <w:pPr>
@@ -6642,7 +6747,7 @@
                 <w:sz w:val="20"/>
                 <w:szCs w:val="20"/>
               </w:rPr>
-              <w:t xml:space="preserve">txtCommonCode (TextEdit, MaxLength 50) + lciCommonCode caption 'Mã dùng chung', đặt cạnh ô Mã BHYT (txtBHYTCode) hiện có</w:t>
+              <w:t xml:space="preserve">txtCommonCode và txtHl7Code (TextEdit, MaxLength 50) kèm caption Mã dùng chung và Mã HL7, đặt ở cuối nhóm thông tin chỉ số</w:t>
             </w:r>
           </w:p>
         </w:tc>
@@ -6722,7 +6827,7 @@
                 <w:sz w:val="20"/>
                 <w:szCs w:val="20"/>
               </w:rPr>
-              <w:t xml:space="preserve">COMMON_CODE, caption 'Mã dùng chung', đặt sau cột Mã BHYT (grclBHYTCode)</w:t>
+              <w:t xml:space="preserve">COMMON_CODE và HL7_CODE, caption Mã dùng chung và Mã HL7, đặt ngay sau cột Tên BHYT</w:t>
             </w:r>
           </w:p>
         </w:tc>
@@ -6802,7 +6907,7 @@
                 <w:sz w:val="20"/>
                 <w:szCs w:val="20"/>
               </w:rPr>
-              <w:t xml:space="preserve">txtCommonCode.Text = data.COMMON_CODE — cạnh chỗ gán txtBHYTCode.Text, frmHisTestIndex.cs dòng 782</w:t>
+              <w:t xml:space="preserve">Gán COMMON_CODE và HL7_CODE lên 2 ô nhập, cạnh chỗ gán txtBHYTCode.Text</w:t>
             </w:r>
           </w:p>
         </w:tc>
@@ -6882,7 +6987,7 @@
                 <w:sz w:val="20"/>
                 <w:szCs w:val="20"/>
               </w:rPr>
-              <w:t xml:space="preserve">currentDTO.COMMON_CODE = txtCommonCode.Text.Trim() trong UpdateDTOFromDataForm, frmHisTestIndex.cs dòng 1168</w:t>
+              <w:t xml:space="preserve">Gán COMMON_CODE và HL7_CODE từ 2 ô nhập trong UpdateDTOFromDataForm</w:t>
             </w:r>
           </w:p>
         </w:tc>
@@ -6937,7 +7042,7 @@
                 <w:sz w:val="20"/>
                 <w:szCs w:val="20"/>
               </w:rPr>
-              <w:t xml:space="preserve">Validate</w:t>
+              <w:t xml:space="preserve">Giới hạn nhập</w:t>
             </w:r>
           </w:p>
         </w:tc>
@@ -6962,7 +7067,7 @@
                 <w:sz w:val="20"/>
                 <w:szCs w:val="20"/>
               </w:rPr>
-              <w:t xml:space="preserve">Rule độ dài 50 — dùng lại ValidMaxlength hoặc ValidTextEditMaxLenght sẵn có của plugin</w:t>
+              <w:t xml:space="preserve">Properties.MaxLength = 50 trên cả hai ô, khớp độ dài cột nên không cần thêm rule validate</w:t>
             </w:r>
           </w:p>
         </w:tc>
@@ -12659,7 +12764,7 @@
         <w:spacing w:after="120" w:before="260"/>
       </w:pPr>
       <w:r>
-        <w:t xml:space="preserve">6.3 HIS_TEST_INDEX — mã dùng chung của chỉ số</w:t>
+        <w:t xml:space="preserve">6.3 HIS_TEST_INDEX — mã dùng chung và mã HL7 của chỉ số</w:t>
       </w:r>
     </w:p>
     <w:tbl>
@@ -12842,6 +12947,86 @@
           </w:p>
         </w:tc>
       </w:tr>
+      <w:tr>
+        <w:trPr>
+          <w:tblHeader w:val="false"/>
+        </w:trPr>
+        <w:tc>
+          <w:tcPr>
+            <w:tcW w:type="dxa" w:w="2621"/>
+            <w:tcMar>
+              <w:top w:type="dxa" w:w="60"/>
+              <w:left w:type="dxa" w:w="90"/>
+              <w:bottom w:type="dxa" w:w="60"/>
+              <w:right w:type="dxa" w:w="90"/>
+            </w:tcMar>
+          </w:tcPr>
+          <w:p>
+            <w:pPr>
+              <w:spacing w:after="0"/>
+            </w:pPr>
+            <w:r>
+              <w:rPr>
+                <w:b w:val="false"/>
+                <w:bCs w:val="false"/>
+                <w:sz w:val="20"/>
+                <w:szCs w:val="20"/>
+              </w:rPr>
+              <w:t xml:space="preserve">HL7_CODE</w:t>
+            </w:r>
+          </w:p>
+        </w:tc>
+        <w:tc>
+          <w:tcPr>
+            <w:tcW w:type="dxa" w:w="2246"/>
+            <w:tcMar>
+              <w:top w:type="dxa" w:w="60"/>
+              <w:left w:type="dxa" w:w="90"/>
+              <w:bottom w:type="dxa" w:w="60"/>
+              <w:right w:type="dxa" w:w="90"/>
+            </w:tcMar>
+          </w:tcPr>
+          <w:p>
+            <w:pPr>
+              <w:spacing w:after="0"/>
+            </w:pPr>
+            <w:r>
+              <w:rPr>
+                <w:b w:val="false"/>
+                <w:bCs w:val="false"/>
+                <w:sz w:val="20"/>
+                <w:szCs w:val="20"/>
+              </w:rPr>
+              <w:t xml:space="preserve">VARCHAR2(50 CHAR)</w:t>
+            </w:r>
+          </w:p>
+        </w:tc>
+        <w:tc>
+          <w:tcPr>
+            <w:tcW w:type="dxa" w:w="4493"/>
+            <w:tcMar>
+              <w:top w:type="dxa" w:w="60"/>
+              <w:left w:type="dxa" w:w="90"/>
+              <w:bottom w:type="dxa" w:w="60"/>
+              <w:right w:type="dxa" w:w="90"/>
+            </w:tcMar>
+          </w:tcPr>
+          <w:p>
+            <w:pPr>
+              <w:spacing w:after="0"/>
+            </w:pPr>
+            <w:r>
+              <w:rPr>
+                <w:b w:val="false"/>
+                <w:bCs w:val="false"/>
+                <w:sz w:val="20"/>
+                <w:szCs w:val="20"/>
+              </w:rPr>
+              <w:t xml:space="preserve">Mã chỉ số theo chuẩn HL7 — trao đổi bản tin với máy xét nghiệm và hệ thống ngoài</w:t>
+            </w:r>
+          </w:p>
+        </w:tc>
+      </w:tr>
     </w:tbl>
     <w:p>
       <w:pPr>
@@ -12856,7 +13041,7 @@
           <w:sz w:val="22"/>
           <w:szCs w:val="22"/>
         </w:rPr>
-        <w:t xml:space="preserve">Phải cập nhật lại view V_HIS_TEST_INDEX (thêm cột vào câu SELECT) vì frontend nạp danh mục qua BackendDataWorker từ view và lưới danh mục bind theo view.</w:t>
+        <w:t xml:space="preserve">Phải cập nhật lại view V_HIS_TEST_INDEX (thêm 2 cột vào câu SELECT) vì frontend nạp danh mục qua BackendDataWorker từ view và lưới danh mục bind theo view.</w:t>
       </w:r>
     </w:p>
     <w:p>
@@ -13880,7 +14065,7 @@
                 <w:sz w:val="20"/>
                 <w:szCs w:val="20"/>
               </w:rPr>
-              <w:t xml:space="preserve">Sửa — thêm COMMON_CODE cho HIS_TEST_INDEX</w:t>
+              <w:t xml:space="preserve">Sửa — thêm COMMON_CODE, HL7_CODE cho HIS_TEST_INDEX</w:t>
             </w:r>
           </w:p>
         </w:tc>
@@ -13935,7 +14120,7 @@
                 <w:sz w:val="20"/>
                 <w:szCs w:val="20"/>
               </w:rPr>
-              <w:t xml:space="preserve">Sửa — thêm COMMON_CODE cho V_HIS_TEST_INDEX</w:t>
+              <w:t xml:space="preserve">Sửa — thêm COMMON_CODE, HL7_CODE cho V_HIS_TEST_INDEX</w:t>
             </w:r>
           </w:p>
         </w:tc>
@@ -13990,62 +14175,7 @@
                 <w:sz w:val="20"/>
                 <w:szCs w:val="20"/>
               </w:rPr>
-              <w:t xml:space="preserve">Sửa — thêm property COMMON_CODE</w:t>
-            </w:r>
-          </w:p>
-        </w:tc>
-      </w:tr>
-      <w:tr>
-        <w:trPr>
-          <w:tblHeader w:val="false"/>
-        </w:trPr>
-        <w:tc>
-          <w:tcPr>
-            <w:tcW w:type="dxa" w:w="6552"/>
-            <w:tcMar>
-              <w:top w:type="dxa" w:w="60"/>
-              <w:left w:type="dxa" w:w="90"/>
-              <w:bottom w:type="dxa" w:w="60"/>
-              <w:right w:type="dxa" w:w="90"/>
-            </w:tcMar>
-          </w:tcPr>
-          <w:p>
-            <w:pPr>
-              <w:spacing w:after="0"/>
-            </w:pPr>
-            <w:r>
-              <w:rPr>
-                <w:b w:val="false"/>
-                <w:bCs w:val="false"/>
-                <w:sz w:val="20"/>
-                <w:szCs w:val="20"/>
-              </w:rPr>
-              <w:t xml:space="preserve">MOS.MANAGER/HisTestIndex/HisTestIndexCheck.cs</w:t>
-            </w:r>
-          </w:p>
-        </w:tc>
-        <w:tc>
-          <w:tcPr>
-            <w:tcW w:type="dxa" w:w="2808"/>
-            <w:tcMar>
-              <w:top w:type="dxa" w:w="60"/>
-              <w:left w:type="dxa" w:w="90"/>
-              <w:bottom w:type="dxa" w:w="60"/>
-              <w:right w:type="dxa" w:w="90"/>
-            </w:tcMar>
-          </w:tcPr>
-          <w:p>
-            <w:pPr>
-              <w:spacing w:after="0"/>
-            </w:pPr>
-            <w:r>
-              <w:rPr>
-                <w:b w:val="false"/>
-                <w:bCs w:val="false"/>
-                <w:sz w:val="20"/>
-                <w:szCs w:val="20"/>
-              </w:rPr>
-              <w:t xml:space="preserve">Sửa — rule độ dài 50 cho COMMON_CODE</w:t>
+              <w:t xml:space="preserve">Sửa — thêm property COMMON_CODE, HL7_CODE</w:t>
             </w:r>
           </w:p>
         </w:tc>
@@ -14955,7 +15085,7 @@
                 <w:sz w:val="20"/>
                 <w:szCs w:val="20"/>
               </w:rPr>
-              <w:t xml:space="preserve">Ô nhập txtCommonCode và cột lưới COMMON_CODE</w:t>
+              <w:t xml:space="preserve">2 ô nhập và 2 cột lưới cho mã dùng chung, mã HL7</w:t>
             </w:r>
           </w:p>
         </w:tc>
@@ -15035,7 +15165,7 @@
                 <w:sz w:val="20"/>
                 <w:szCs w:val="20"/>
               </w:rPr>
-              <w:t xml:space="preserve">Nạp và lưu COMMON_CODE, validate độ dài 50</w:t>
+              <w:t xml:space="preserve">Nạp và lưu 2 trường, set caption đa ngôn ngữ</w:t>
             </w:r>
           </w:p>
         </w:tc>
@@ -15115,7 +15245,7 @@
                 <w:sz w:val="20"/>
                 <w:szCs w:val="20"/>
               </w:rPr>
-              <w:t xml:space="preserve">Caption ô nhập và cột lưới</w:t>
+              <w:t xml:space="preserve">4 key caption cho 2 ô nhập và 2 cột lưới</w:t>
             </w:r>
           </w:p>
         </w:tc>
@@ -16508,7 +16638,7 @@
           <w:sz w:val="22"/>
           <w:szCs w:val="22"/>
         </w:rPr>
-        <w:t xml:space="preserve">Mở danh mục chỉ số: thấy ô Mã dùng chung và cột Mã dùng chung trên lưới.</w:t>
+        <w:t xml:space="preserve">Mở danh mục chỉ số: thấy ô Mã dùng chung, ô Mã HL7 và 2 cột tương ứng trên lưới.</w:t>
       </w:r>
     </w:p>
     <w:p>
@@ -16525,7 +16655,7 @@
           <w:sz w:val="22"/>
           <w:szCs w:val="22"/>
         </w:rPr>
-        <w:t xml:space="preserve">Thêm mới chỉ số kèm mã dùng chung: lưu thành công, lưới hiển thị đúng giá trị.</w:t>
+        <w:t xml:space="preserve">Thêm mới chỉ số kèm mã dùng chung và mã HL7: lưu thành công, lưới hiển thị đúng giá trị.</w:t>
       </w:r>
     </w:p>
     <w:p>
@@ -16542,7 +16672,7 @@
           <w:sz w:val="22"/>
           <w:szCs w:val="22"/>
         </w:rPr>
-        <w:t xml:space="preserve">Sửa mã dùng chung của chỉ số đã có: lưu và hiển thị lại đúng.</w:t>
+        <w:t xml:space="preserve">Sửa mã dùng chung hoặc mã HL7 của chỉ số đã có: lưu và hiển thị lại đúng.</w:t>
       </w:r>
     </w:p>
     <w:p>
@@ -16559,7 +16689,7 @@
           <w:sz w:val="22"/>
           <w:szCs w:val="22"/>
         </w:rPr>
-        <w:t xml:space="preserve">Nhập quá 50 ký tự: hiện cảnh báo tại ô nhập, không cho lưu.</w:t>
+        <w:t xml:space="preserve">Nhập quá 50 ký tự: ô nhập không nhận thêm ký tự (MaxLength = 50).</w:t>
       </w:r>
     </w:p>
     <w:p>
@@ -16576,7 +16706,7 @@
           <w:sz w:val="22"/>
           <w:szCs w:val="22"/>
         </w:rPr>
-        <w:t xml:space="preserve">Để trống mã dùng chung: vẫn lưu được (không bắt buộc).</w:t>
+        <w:t xml:space="preserve">Để trống mã dùng chung hoặc mã HL7: vẫn lưu được (không bắt buộc).</w:t>
       </w:r>
     </w:p>
     <w:sectPr>

</xml_diff>